<commit_message>
BPCE IT : le pilote groupe AAP2 sort de la liste
L'inventaire dynamique n'était que la partie visible : le périmètre a été
le premier du groupe à recevoir la plateforme, livrée nue. Modèle
d'habilitation, nomenclatures, granularité de déploiement, inventaire
enrichi des variables des playbooks, standards présentés en CODIR puis
transmis à une seconde production applicative par formation.

Le Word est resserré (marges, interligne des puces, espacement des blocs)
pour absorber ces six lignes sans passer à trois pages.

Co-Authored-By: Claude Opus 5 (1M context) <noreply@anthropic.com>
Claude-Session: https://claude.ai/code/session_01WPwmy5B8Mxwk2TEUDeSb7c
</commit_message>
<xml_diff>
--- a/cv-stephen-casse-en.docx
+++ b/cv-stephen-casse-en.docx
@@ -4,7 +4,7 @@
   <w:body>
     <w:tbl>
       <w:tblPr>
-        <w:tblW w:w="10826" w:type="dxa"/>
+        <w:tblW w:w="10906" w:type="dxa"/>
         <w:tblBorders>
           <w:top w:val="none" w:sz="0" w:space="0" w:color="auto"/>
           <w:left w:val="none" w:sz="0" w:space="0" w:color="auto"/>
@@ -21,7 +21,7 @@
       </w:tblPr>
       <w:tblGrid>
         <w:gridCol w:w="1400"/>
-        <w:gridCol w:w="9426"/>
+        <w:gridCol w:w="9506"/>
       </w:tblGrid>
       <w:tr>
         <w:tc>
@@ -76,7 +76,7 @@
         </w:tc>
         <w:tc>
           <w:tcPr>
-            <w:tcW w:w="9426" w:type="dxa"/>
+            <w:tcW w:w="9506" w:type="dxa"/>
             <w:shd w:val="clear" w:color="auto" w:fill="F3EAF6"/>
             <w:tcMar>
               <w:top w:w="240" w:type="dxa"/>
@@ -88,7 +88,7 @@
           <w:p>
             <w:pPr>
               <w:tabs>
-                <w:tab w:val="right" w:pos="8966"/>
+                <w:tab w:val="right" w:pos="9046"/>
               </w:tabs>
               <w:spacing w:before="0" w:after="40" w:line="252" w:lineRule="auto"/>
             </w:pPr>
@@ -174,7 +174,7 @@
     </w:tbl>
     <w:tbl>
       <w:tblPr>
-        <w:tblW w:w="10826" w:type="dxa"/>
+        <w:tblW w:w="10906" w:type="dxa"/>
         <w:tblLayout w:type="fixed"/>
         <w:tblCellMar>
           <w:left w:w="0" w:type="dxa"/>
@@ -182,13 +182,13 @@
         </w:tblCellMar>
       </w:tblPr>
       <w:tblGrid>
-        <w:gridCol w:w="10826"/>
+        <w:gridCol w:w="10906"/>
       </w:tblGrid>
       <w:tr>
         ['
         <w:tc>
           <w:tcPr>
-            <w:tcW w:w="10826" w:type="dxa"/>
+            <w:tcW w:w="10906" w:type="dxa"/>
             <w:tcBorders>
               <w:top w:val="single" w:sz="4" w:space="0" w:color="f7f2f9"/>
               <w:left w:val="single" w:sz="4" w:space="0" w:color="f7f2f9"/>
@@ -242,7 +242,7 @@
     </w:p>
     <w:tbl>
       <w:tblPr>
-        <w:tblW w:w="10764" w:type="dxa"/>
+        <w:tblW w:w="10844" w:type="dxa"/>
         <w:tblLayout w:type="fixed"/>
         <w:tblCellMar>
           <w:left w:w="0" w:type="dxa"/>
@@ -250,18 +250,18 @@
         </w:tblCellMar>
       </w:tblPr>
       <w:tblGrid>
-        <w:gridCol w:w="2646"/>
+        <w:gridCol w:w="2666"/>
         <w:gridCol w:w="60"/>
-        <w:gridCol w:w="2646"/>
+        <w:gridCol w:w="2666"/>
         <w:gridCol w:w="60"/>
-        <w:gridCol w:w="2646"/>
+        <w:gridCol w:w="2666"/>
         <w:gridCol w:w="60"/>
-        <w:gridCol w:w="2646"/>
+        <w:gridCol w:w="2666"/>
       </w:tblGrid>
       <w:tr>
         <w:tc>
           <w:tcPr>
-            <w:tcW w:w="2646" w:type="dxa"/>
+            <w:tcW w:w="2666" w:type="dxa"/>
             <w:tcBorders>
               <w:top w:val="single" w:sz="24" w:space="0" w:color="6866A7"/>
               <w:left w:val="single" w:sz="4" w:space="0" w:color="cac4d2"/>
@@ -324,7 +324,7 @@
         </w:tc>
         <w:tc>
           <w:tcPr>
-            <w:tcW w:w="2646" w:type="dxa"/>
+            <w:tcW w:w="2666" w:type="dxa"/>
             <w:tcBorders>
               <w:top w:val="single" w:sz="24" w:space="0" w:color="A86F9F"/>
               <w:left w:val="single" w:sz="4" w:space="0" w:color="cac4d2"/>
@@ -387,7 +387,7 @@
         </w:tc>
         <w:tc>
           <w:tcPr>
-            <w:tcW w:w="2646" w:type="dxa"/>
+            <w:tcW w:w="2666" w:type="dxa"/>
             <w:tcBorders>
               <w:top w:val="single" w:sz="24" w:space="0" w:color="6866A7"/>
               <w:left w:val="single" w:sz="4" w:space="0" w:color="cac4d2"/>
@@ -450,7 +450,7 @@
         </w:tc>
         <w:tc>
           <w:tcPr>
-            <w:tcW w:w="2646" w:type="dxa"/>
+            <w:tcW w:w="2666" w:type="dxa"/>
             <w:tcBorders>
               <w:top w:val="single" w:sz="24" w:space="0" w:color="A86F9F"/>
               <w:left w:val="single" w:sz="4" w:space="0" w:color="cac4d2"/>
@@ -532,9 +532,9 @@
         <w:keepNext/>
         <w:keepLines/>
         <w:tabs>
-          <w:tab w:val="right" w:pos="10826"/>
+          <w:tab w:val="right" w:pos="10906"/>
         </w:tabs>
-        <w:spacing w:before="140" w:after="30" w:line="252" w:lineRule="auto"/>
+        <w:spacing w:before="110" w:after="30" w:line="252" w:lineRule="auto"/>
       </w:pPr>
       <w:r>
         <w:rPr>
@@ -608,7 +608,7 @@
     </w:p>
     <w:p>
       <w:pPr>
-        <w:spacing w:before="0" w:after="40" w:line="240" w:lineRule="auto"/>
+        <w:spacing w:before="0" w:after="24" w:line="232" w:lineRule="auto"/>
         <w:ind w:left="227" w:hanging="142"/>
       </w:pPr>
       <w:r>
@@ -663,7 +663,7 @@
     </w:p>
     <w:p>
       <w:pPr>
-        <w:spacing w:before="0" w:after="40" w:line="240" w:lineRule="auto"/>
+        <w:spacing w:before="0" w:after="24" w:line="232" w:lineRule="auto"/>
         <w:ind w:left="227" w:hanging="142"/>
       </w:pPr>
       <w:r>
@@ -698,7 +698,7 @@
     </w:p>
     <w:p>
       <w:pPr>
-        <w:spacing w:before="0" w:after="40" w:line="240" w:lineRule="auto"/>
+        <w:spacing w:before="0" w:after="24" w:line="232" w:lineRule="auto"/>
         <w:ind w:left="227" w:hanging="142"/>
       </w:pPr>
       <w:r>
@@ -765,9 +765,9 @@
         <w:keepNext/>
         <w:keepLines/>
         <w:tabs>
-          <w:tab w:val="right" w:pos="10826"/>
+          <w:tab w:val="right" w:pos="10906"/>
         </w:tabs>
-        <w:spacing w:before="140" w:after="30" w:line="252" w:lineRule="auto"/>
+        <w:spacing w:before="110" w:after="30" w:line="252" w:lineRule="auto"/>
       </w:pPr>
       <w:r>
         <w:rPr>
@@ -836,12 +836,12 @@
           <w:sz w:val="17"/>
           <w:szCs w:val="17"/>
         </w:rPr>
-        <w:t xml:space="preserve">Turn an abandoned internal tool into a group-wide service, across an estate spanning four RHEL generations.</w:t>
-      </w:r>
-    </w:p>
-    <w:p>
-      <w:pPr>
-        <w:spacing w:before="0" w:after="40" w:line="240" w:lineRule="auto"/>
+        <w:t xml:space="preserve">Turn an abandoned internal tool into a group-wide service across an estate spanning four RHEL generations, and run the group pilot for the automation platform.</w:t>
+      </w:r>
+    </w:p>
+    <w:p>
+      <w:pPr>
+        <w:spacing w:before="0" w:after="24" w:line="232" w:lineRule="auto"/>
         <w:ind w:left="227" w:hanging="142"/>
       </w:pPr>
       <w:r>
@@ -896,7 +896,7 @@
     </w:p>
     <w:p>
       <w:pPr>
-        <w:spacing w:before="0" w:after="40" w:line="240" w:lineRule="auto"/>
+        <w:spacing w:before="0" w:after="24" w:line="232" w:lineRule="auto"/>
         <w:ind w:left="227" w:hanging="142"/>
       </w:pPr>
       <w:r>
@@ -951,7 +951,7 @@
     </w:p>
     <w:p>
       <w:pPr>
-        <w:spacing w:before="0" w:after="40" w:line="240" w:lineRule="auto"/>
+        <w:spacing w:before="0" w:after="24" w:line="232" w:lineRule="auto"/>
         <w:ind w:left="227" w:hanging="142"/>
       </w:pPr>
       <w:r>
@@ -972,21 +972,21 @@
           <w:sz w:val="18"/>
           <w:szCs w:val="18"/>
         </w:rPr>
-        <w:t xml:space="preserve">Inventory derived from the CMDB</w:t>
-      </w:r>
-      <w:r>
-        <w:rPr>
-          <w:rFonts w:ascii="Calibri" w:hAnsi="Calibri" w:cs="Calibri"/>
-          <w:color w:val="484550"/>
-          <w:sz w:val="18"/>
-          <w:szCs w:val="18"/>
-        </w:rPr>
-        <w:t xml:space="preserve">: the Ansible Automation Platform inventory was maintained by hand; it is now built dynamically from the CMDB with normalised environments — derived from the source of truth instead of being declared twice. Same principle for Java keystores and truststores.</w:t>
-      </w:r>
-    </w:p>
-    <w:p>
-      <w:pPr>
-        <w:spacing w:before="0" w:after="40" w:line="240" w:lineRule="auto"/>
+        <w:t xml:space="preserve">Group pilot for Ansible Automation Platform</w:t>
+      </w:r>
+      <w:r>
+        <w:rPr>
+          <w:rFonts w:ascii="Calibri" w:hAnsi="Calibri" w:cs="Calibri"/>
+          <w:color w:val="484550"/>
+          <w:sz w:val="18"/>
+          <w:szCs w:val="18"/>
+        </w:rPr>
+        <w:t xml:space="preserve">: the first application production scope in the group to receive the platform, delivered bare. I drove the access model (accounts, privilege levels) and defined the usage standards — naming conventions, deployment granularity by group, by server type or by whole environment. The inventory is built dynamically from the CMDB and enriched with the variables the playbooks consume: derived from the source of truth instead of maintained by hand. Standards presented to the executive committee, then handed over to a second production team I trained. Same inventory principle for Java keystores and truststores.</w:t>
+      </w:r>
+    </w:p>
+    <w:p>
+      <w:pPr>
+        <w:spacing w:before="0" w:after="24" w:line="232" w:lineRule="auto"/>
         <w:ind w:left="227" w:hanging="142"/>
       </w:pPr>
       <w:r>
@@ -1005,7 +1005,7 @@
           <w:sz w:val="18"/>
           <w:szCs w:val="18"/>
         </w:rPr>
-        <w:t xml:space="preserve">Daily run, 24/7 on-call rotation, application-domain lead with the business IT departments; team training (Ansible, Jenkins, Artifactory, Bitbucket) and group-wide Ansible Automation Platform presentation.</w:t>
+        <w:t xml:space="preserve">Daily run, 24/7 on-call rotation, application-domain lead with the business IT departments; team training on Ansible, Jenkins, Artifactory and Bitbucket, onboarding material.</w:t>
       </w:r>
     </w:p>
     <w:p>
@@ -1013,9 +1013,9 @@
         <w:keepNext/>
         <w:keepLines/>
         <w:tabs>
-          <w:tab w:val="right" w:pos="10826"/>
+          <w:tab w:val="right" w:pos="10906"/>
         </w:tabs>
-        <w:spacing w:before="140" w:after="30" w:line="252" w:lineRule="auto"/>
+        <w:spacing w:before="110" w:after="30" w:line="252" w:lineRule="auto"/>
       </w:pPr>
       <w:r>
         <w:rPr>
@@ -1089,7 +1089,7 @@
     </w:p>
     <w:p>
       <w:pPr>
-        <w:spacing w:before="0" w:after="40" w:line="240" w:lineRule="auto"/>
+        <w:spacing w:before="0" w:after="24" w:line="232" w:lineRule="auto"/>
         <w:ind w:left="227" w:hanging="142"/>
       </w:pPr>
       <w:r>
@@ -1124,7 +1124,7 @@
     </w:p>
     <w:p>
       <w:pPr>
-        <w:spacing w:before="0" w:after="40" w:line="240" w:lineRule="auto"/>
+        <w:spacing w:before="0" w:after="24" w:line="232" w:lineRule="auto"/>
         <w:ind w:left="227" w:hanging="142"/>
       </w:pPr>
       <w:r>
@@ -1168,7 +1168,7 @@
     </w:p>
     <w:p>
       <w:pPr>
-        <w:spacing w:before="0" w:after="40" w:line="240" w:lineRule="auto"/>
+        <w:spacing w:before="0" w:after="24" w:line="232" w:lineRule="auto"/>
         <w:ind w:left="227" w:hanging="142"/>
       </w:pPr>
       <w:r>
@@ -1236,7 +1236,7 @@
     </w:p>
     <w:tbl>
       <w:tblPr>
-        <w:tblW w:w="10826" w:type="dxa"/>
+        <w:tblW w:w="10906" w:type="dxa"/>
         <w:tblBorders>
           <w:top w:val="none" w:sz="0" w:space="0" w:color="auto"/>
           <w:left w:val="none" w:sz="0" w:space="0" w:color="auto"/>
@@ -1252,14 +1252,14 @@
         </w:tblCellMar>
       </w:tblPr>
       <w:tblGrid>
-        <w:gridCol w:w="5263"/>
+        <w:gridCol w:w="5303"/>
         <w:gridCol w:w="300"/>
-        <w:gridCol w:w="5263"/>
+        <w:gridCol w:w="5303"/>
       </w:tblGrid>
       <w:tr>
         <w:tc>
           <w:tcPr>
-            <w:tcW w:w="5263" w:type="dxa"/>
+            <w:tcW w:w="5303" w:type="dxa"/>
             <w:tcMar>
               <w:top w:w="80" w:type="dxa"/>
               <w:left w:w="120" w:type="dxa"/>
@@ -1318,7 +1318,7 @@
         </w:tc>
         <w:tc>
           <w:tcPr>
-            <w:tcW w:w="5263" w:type="dxa"/>
+            <w:tcW w:w="5303" w:type="dxa"/>
             <w:tcMar>
               <w:top w:w="80" w:type="dxa"/>
               <w:left w:w="120" w:type="dxa"/>
@@ -1363,7 +1363,7 @@
       <w:tr>
         <w:tc>
           <w:tcPr>
-            <w:tcW w:w="5263" w:type="dxa"/>
+            <w:tcW w:w="5303" w:type="dxa"/>
             <w:tcMar>
               <w:top w:w="80" w:type="dxa"/>
               <w:left w:w="120" w:type="dxa"/>
@@ -1422,7 +1422,7 @@
         </w:tc>
         <w:tc>
           <w:tcPr>
-            <w:tcW w:w="5263" w:type="dxa"/>
+            <w:tcW w:w="5303" w:type="dxa"/>
             <w:tcMar>
               <w:top w:w="80" w:type="dxa"/>
               <w:left w:w="120" w:type="dxa"/>
@@ -1467,7 +1467,7 @@
       <w:tr>
         <w:tc>
           <w:tcPr>
-            <w:tcW w:w="5263" w:type="dxa"/>
+            <w:tcW w:w="5303" w:type="dxa"/>
             <w:tcMar>
               <w:top w:w="80" w:type="dxa"/>
               <w:left w:w="120" w:type="dxa"/>
@@ -1526,7 +1526,7 @@
         </w:tc>
         <w:tc>
           <w:tcPr>
-            <w:tcW w:w="5263" w:type="dxa"/>
+            <w:tcW w:w="5303" w:type="dxa"/>
             <w:tcMar>
               <w:top w:w="80" w:type="dxa"/>
               <w:left w:w="120" w:type="dxa"/>
@@ -1571,7 +1571,7 @@
       <w:tr>
         <w:tc>
           <w:tcPr>
-            <w:tcW w:w="5263" w:type="dxa"/>
+            <w:tcW w:w="5303" w:type="dxa"/>
             <w:tcMar>
               <w:top w:w="80" w:type="dxa"/>
               <w:left w:w="120" w:type="dxa"/>
@@ -1630,7 +1630,7 @@
         </w:tc>
         <w:tc>
           <w:tcPr>
-            <w:tcW w:w="5263" w:type="dxa"/>
+            <w:tcW w:w="5303" w:type="dxa"/>
             <w:tcMar>
               <w:top w:w="80" w:type="dxa"/>
               <w:left w:w="120" w:type="dxa"/>
@@ -1675,7 +1675,7 @@
       <w:tr>
         <w:tc>
           <w:tcPr>
-            <w:tcW w:w="5263" w:type="dxa"/>
+            <w:tcW w:w="5303" w:type="dxa"/>
             <w:tcMar>
               <w:top w:w="80" w:type="dxa"/>
               <w:left w:w="120" w:type="dxa"/>
@@ -1734,7 +1734,7 @@
         </w:tc>
         <w:tc>
           <w:tcPr>
-            <w:tcW w:w="5263" w:type="dxa"/>
+            <w:tcW w:w="5303" w:type="dxa"/>
             <w:tcMar>
               <w:top w:w="80" w:type="dxa"/>
               <w:left w:w="120" w:type="dxa"/>
@@ -1782,7 +1782,7 @@
     </w:p>
     <w:tbl>
       <w:tblPr>
-        <w:tblW w:w="10826" w:type="dxa"/>
+        <w:tblW w:w="10906" w:type="dxa"/>
         <w:tblLayout w:type="fixed"/>
         <w:tblCellMar>
           <w:left w:w="0" w:type="dxa"/>
@@ -1790,14 +1790,14 @@
         </w:tblCellMar>
       </w:tblPr>
       <w:tblGrid>
-        <w:gridCol w:w="5293"/>
+        <w:gridCol w:w="5333"/>
         <w:gridCol w:w="240"/>
-        <w:gridCol w:w="5293"/>
+        <w:gridCol w:w="5333"/>
       </w:tblGrid>
       <w:tr>
         <w:tc>
           <w:tcPr>
-            <w:tcW w:w="5293" w:type="dxa"/>
+            <w:tcW w:w="5333" w:type="dxa"/>
             <w:tcBorders>
               <w:top w:val="single" w:sz="4" w:space="0" w:color="cac4d2"/>
               <w:left w:val="single" w:sz="24" w:space="0" w:color="6866A7"/>
@@ -1876,7 +1876,7 @@
         </w:tc>
         <w:tc>
           <w:tcPr>
-            <w:tcW w:w="5293" w:type="dxa"/>
+            <w:tcW w:w="5333" w:type="dxa"/>
             <w:tcBorders>
               <w:top w:val="single" w:sz="4" w:space="0" w:color="cac4d2"/>
               <w:left w:val="single" w:sz="24" w:space="0" w:color="A86F9F"/>
@@ -1941,7 +1941,7 @@
       <w:tr>
         <w:tc>
           <w:tcPr>
-            <w:tcW w:w="5293" w:type="dxa"/>
+            <w:tcW w:w="5333" w:type="dxa"/>
             <w:tcMar>
               <w:top w:w="0" w:type="dxa"/>
               <w:left w:w="0" w:type="dxa"/>
@@ -1973,7 +1973,7 @@
         </w:tc>
         <w:tc>
           <w:tcPr>
-            <w:tcW w:w="5293" w:type="dxa"/>
+            <w:tcW w:w="5333" w:type="dxa"/>
             <w:tcMar>
               <w:top w:w="0" w:type="dxa"/>
               <w:left w:w="0" w:type="dxa"/>
@@ -1991,7 +1991,7 @@
       <w:tr>
         <w:tc>
           <w:tcPr>
-            <w:tcW w:w="5293" w:type="dxa"/>
+            <w:tcW w:w="5333" w:type="dxa"/>
             <w:tcBorders>
               <w:top w:val="single" w:sz="4" w:space="0" w:color="cac4d2"/>
               <w:left w:val="single" w:sz="24" w:space="0" w:color="6866A7"/>
@@ -2070,7 +2070,7 @@
         </w:tc>
         <w:tc>
           <w:tcPr>
-            <w:tcW w:w="5293" w:type="dxa"/>
+            <w:tcW w:w="5333" w:type="dxa"/>
             <w:tcMar>
               <w:top w:w="80" w:type="dxa"/>
               <w:left w:w="120" w:type="dxa"/>
@@ -2093,7 +2093,7 @@
     </w:p>
     <w:tbl>
       <w:tblPr>
-        <w:tblW w:w="10826" w:type="dxa"/>
+        <w:tblW w:w="10906" w:type="dxa"/>
         <w:tblBorders>
           <w:top w:val="none" w:sz="0" w:space="0" w:color="auto"/>
           <w:left w:val="none" w:sz="0" w:space="0" w:color="auto"/>
@@ -2109,14 +2109,14 @@
         </w:tblCellMar>
       </w:tblPr>
       <w:tblGrid>
-        <w:gridCol w:w="5263"/>
+        <w:gridCol w:w="5303"/>
         <w:gridCol w:w="300"/>
-        <w:gridCol w:w="5263"/>
+        <w:gridCol w:w="5303"/>
       </w:tblGrid>
       <w:tr>
         <w:tc>
           <w:tcPr>
-            <w:tcW w:w="5263" w:type="dxa"/>
+            <w:tcW w:w="5303" w:type="dxa"/>
             <w:tcMar>
               <w:top w:w="80" w:type="dxa"/>
               <w:left w:w="120" w:type="dxa"/>
@@ -2251,7 +2251,7 @@
         </w:tc>
         <w:tc>
           <w:tcPr>
-            <w:tcW w:w="5263" w:type="dxa"/>
+            <w:tcW w:w="5303" w:type="dxa"/>
             <w:tcMar>
               <w:top w:w="80" w:type="dxa"/>
               <w:left w:w="120" w:type="dxa"/>
@@ -2344,7 +2344,7 @@
     </w:tbl>
     <w:sectPr>
       <w:pgSz w:w="11906" w:h="16838"/>
-      <w:pgMar w:top="540" w:right="540" w:bottom="540" w:left="540" w:header="0" w:footer="0" w:gutter="0"/>
+      <w:pgMar w:top="500" w:right="500" w:bottom="500" w:left="500" w:header="0" w:footer="0" w:gutter="0"/>
     </w:sectPr>
   </w:body>
 </w:document>

</xml_diff>

<commit_message>
BPCE IT : AAP2 en tête, et les deux sections du service de logs réunies
Le pilote AAP2 s'était glissé entre le service et l'explication de sa
portabilité, qui forment une paire causale. Il passe en première position,
où il est de toute façon plus significatif — et Ansible est la cible de
mission, pas Apache.

Co-Authored-By: Claude Opus 5 (1M context) <noreply@anthropic.com>
Claude-Session: https://claude.ai/code/session_01WPwmy5B8Mxwk2TEUDeSb7c
</commit_message>
<xml_diff>
--- a/cv-stephen-casse-en.docx
+++ b/cv-stephen-casse-en.docx
@@ -836,7 +836,7 @@
           <w:sz w:val="17"/>
           <w:szCs w:val="17"/>
         </w:rPr>
-        <w:t xml:space="preserve">Turn an abandoned internal tool into a group-wide service across an estate spanning four RHEL generations, and run the group pilot for the automation platform.</w:t>
+        <w:t xml:space="preserve">Run the group pilot for the automation platform, and turn an abandoned internal tool into a group-wide service across an estate spanning four RHEL generations.</w:t>
       </w:r>
     </w:p>
     <w:p>
@@ -862,36 +862,16 @@
           <w:sz w:val="18"/>
           <w:szCs w:val="18"/>
         </w:rPr>
-        <w:t xml:space="preserve">Logs for developers, without giving them production</w:t>
-      </w:r>
-      <w:r>
-        <w:rPr>
-          <w:rFonts w:ascii="Calibri" w:hAnsi="Calibri" w:cs="Calibri"/>
-          <w:color w:val="484550"/>
-          <w:sz w:val="18"/>
-          <w:szCs w:val="18"/>
-        </w:rPr>
-        <w:t xml:space="preserve">: SSH access to production is denied to development teams — so no autonomous way to read an application log, and longer resolution times on every incident. I took over an outdated, unmaintained and insecure tool and turned it into a self-service log consultation service: one instance per server, a dedicated URL, LDAP/Kerberos authentication, browsing and download from the browser. The friction disappears, the security boundary stays intact. </w:t>
-      </w:r>
-      <w:r>
-        <w:rPr>
-          <w:rFonts w:ascii="Calibri" w:hAnsi="Calibri" w:cs="Calibri"/>
-          <w:b/>
-          <w:bCs/>
-          <w:color w:val="484550"/>
-          <w:sz w:val="18"/>
-          <w:szCs w:val="18"/>
-        </w:rPr>
-        <w:t xml:space="preserve">Deployed on ~1,200 servers</w:t>
-      </w:r>
-      <w:r>
-        <w:rPr>
-          <w:rFonts w:ascii="Calibri" w:hAnsi="Calibri" w:cs="Calibri"/>
-          <w:color w:val="484550"/>
-          <w:sz w:val="18"/>
-          <w:szCs w:val="18"/>
-        </w:rPr>
-        <w:t xml:space="preserve">, adopted by all fifteen business IT departments of the division and used by around 200 people across business IT and operations; presented to the executive committee, under review as a group product.</w:t>
+        <w:t xml:space="preserve">Group pilot for Ansible Automation Platform</w:t>
+      </w:r>
+      <w:r>
+        <w:rPr>
+          <w:rFonts w:ascii="Calibri" w:hAnsi="Calibri" w:cs="Calibri"/>
+          <w:color w:val="484550"/>
+          <w:sz w:val="18"/>
+          <w:szCs w:val="18"/>
+        </w:rPr>
+        <w:t xml:space="preserve">: the first application production scope in the group to receive the platform, delivered bare. I drove the access model (accounts, privilege levels) and defined the usage standards — naming conventions, deployment granularity by group, by server type or by whole environment. The inventory is built dynamically from the CMDB and enriched with the variables the playbooks consume: derived from the source of truth instead of maintained by hand. Standards presented to the executive committee, then handed over to a second production team I trained. Same inventory principle for Java keystores and truststores.</w:t>
       </w:r>
     </w:p>
     <w:p>
@@ -917,16 +897,16 @@
           <w:sz w:val="18"/>
           <w:szCs w:val="18"/>
         </w:rPr>
-        <w:t xml:space="preserve">What makes that deployment possible</w:t>
-      </w:r>
-      <w:r>
-        <w:rPr>
-          <w:rFonts w:ascii="Calibri" w:hAnsi="Calibri" w:cs="Calibri"/>
-          <w:color w:val="484550"/>
-          <w:sz w:val="18"/>
-          <w:szCs w:val="18"/>
-        </w:rPr>
-        <w:t xml:space="preserve">: an Apache stack compiled end to end — Apache, APR, OpenSSL, OpenLDAP, Expat — with no system dependency, runnable without root privileges, from RHEL 6 to RHEL 9.5. It installs on a bare Red Hat, coexists with an existing Apache or JBoss and survives an OS upgrade — </w:t>
+        <w:t xml:space="preserve">Logs for developers, without giving them production</w:t>
+      </w:r>
+      <w:r>
+        <w:rPr>
+          <w:rFonts w:ascii="Calibri" w:hAnsi="Calibri" w:cs="Calibri"/>
+          <w:color w:val="484550"/>
+          <w:sz w:val="18"/>
+          <w:szCs w:val="18"/>
+        </w:rPr>
+        <w:t xml:space="preserve">: SSH access to production is denied to development teams — so no autonomous way to read an application log, and longer resolution times on every incident. I took over an outdated, unmaintained and insecure tool and turned it into a self-service log consultation service: one instance per server, a dedicated URL, LDAP/Kerberos authentication, browsing and download from the browser. The friction disappears, the security boundary stays intact. </w:t>
       </w:r>
       <w:r>
         <w:rPr>
@@ -937,16 +917,16 @@
           <w:sz w:val="18"/>
           <w:szCs w:val="18"/>
         </w:rPr>
-        <w:t xml:space="preserve">adopted as the production standard</w:t>
-      </w:r>
-      <w:r>
-        <w:rPr>
-          <w:rFonts w:ascii="Calibri" w:hAnsi="Calibri" w:cs="Calibri"/>
-          <w:color w:val="484550"/>
-          <w:sz w:val="18"/>
-          <w:szCs w:val="18"/>
-        </w:rPr>
-        <w:t xml:space="preserve">. Delivery pipeline Bitbucket → Jenkins → Artifactory → XL Deploy.</w:t>
+        <w:t xml:space="preserve">Deployed on ~1,200 servers</w:t>
+      </w:r>
+      <w:r>
+        <w:rPr>
+          <w:rFonts w:ascii="Calibri" w:hAnsi="Calibri" w:cs="Calibri"/>
+          <w:color w:val="484550"/>
+          <w:sz w:val="18"/>
+          <w:szCs w:val="18"/>
+        </w:rPr>
+        <w:t xml:space="preserve">, adopted by all fifteen business IT departments of the division and used by around 200 people across business IT and operations; presented to the executive committee, under review as a group product.</w:t>
       </w:r>
     </w:p>
     <w:p>
@@ -972,16 +952,36 @@
           <w:sz w:val="18"/>
           <w:szCs w:val="18"/>
         </w:rPr>
-        <w:t xml:space="preserve">Group pilot for Ansible Automation Platform</w:t>
-      </w:r>
-      <w:r>
-        <w:rPr>
-          <w:rFonts w:ascii="Calibri" w:hAnsi="Calibri" w:cs="Calibri"/>
-          <w:color w:val="484550"/>
-          <w:sz w:val="18"/>
-          <w:szCs w:val="18"/>
-        </w:rPr>
-        <w:t xml:space="preserve">: the first application production scope in the group to receive the platform, delivered bare. I drove the access model (accounts, privilege levels) and defined the usage standards — naming conventions, deployment granularity by group, by server type or by whole environment. The inventory is built dynamically from the CMDB and enriched with the variables the playbooks consume: derived from the source of truth instead of maintained by hand. Standards presented to the executive committee, then handed over to a second production team I trained. Same inventory principle for Java keystores and truststores.</w:t>
+        <w:t xml:space="preserve">What makes that deployment possible</w:t>
+      </w:r>
+      <w:r>
+        <w:rPr>
+          <w:rFonts w:ascii="Calibri" w:hAnsi="Calibri" w:cs="Calibri"/>
+          <w:color w:val="484550"/>
+          <w:sz w:val="18"/>
+          <w:szCs w:val="18"/>
+        </w:rPr>
+        <w:t xml:space="preserve">: an Apache stack compiled end to end — Apache, APR, OpenSSL, OpenLDAP, Expat — with no system dependency, runnable without root privileges, from RHEL 6 to RHEL 9.5. It installs on a bare Red Hat, coexists with an existing Apache or JBoss and survives an OS upgrade — </w:t>
+      </w:r>
+      <w:r>
+        <w:rPr>
+          <w:rFonts w:ascii="Calibri" w:hAnsi="Calibri" w:cs="Calibri"/>
+          <w:b/>
+          <w:bCs/>
+          <w:color w:val="484550"/>
+          <w:sz w:val="18"/>
+          <w:szCs w:val="18"/>
+        </w:rPr>
+        <w:t xml:space="preserve">adopted as the production standard</w:t>
+      </w:r>
+      <w:r>
+        <w:rPr>
+          <w:rFonts w:ascii="Calibri" w:hAnsi="Calibri" w:cs="Calibri"/>
+          <w:color w:val="484550"/>
+          <w:sz w:val="18"/>
+          <w:szCs w:val="18"/>
+        </w:rPr>
+        <w:t xml:space="preserve">. Delivery pipeline Bitbucket → Jenkins → Artifactory → XL Deploy.</w:t>
       </w:r>
     </w:p>
     <w:p>

</xml_diff>

<commit_message>
Le corps du CV réserve la hauteur du pied de page
Le .foot est en position absolue et le .body n'avait aucune garde en bas :
le contenu descendait jusqu'à le toucher, sans que le nombre de pages
change — le seul symptôme était visuel. padding-bottom de 46 px, plus deux
lignes récupérées sur BPCE IT là où le texte faisait doublon (le parc RHEL
est déjà dans la puce suivante, les outils de formation sont nommés trois
fois dans le bloc).

Co-Authored-By: Claude Opus 5 (1M context) <noreply@anthropic.com>
Claude-Session: https://claude.ai/code/session_01WPwmy5B8Mxwk2TEUDeSb7c
</commit_message>
<xml_diff>
--- a/cv-stephen-casse-en.docx
+++ b/cv-stephen-casse-en.docx
@@ -836,7 +836,7 @@
           <w:sz w:val="17"/>
           <w:szCs w:val="17"/>
         </w:rPr>
-        <w:t xml:space="preserve">Run the group pilot for the automation platform, and turn an abandoned internal tool into a group-wide service across an estate spanning four RHEL generations.</w:t>
+        <w:t xml:space="preserve">Run the group pilot for the automation platform, and turn an abandoned internal tool into a group-wide service.</w:t>
       </w:r>
     </w:p>
     <w:p>
@@ -1005,7 +1005,7 @@
           <w:sz w:val="18"/>
           <w:szCs w:val="18"/>
         </w:rPr>
-        <w:t xml:space="preserve">Daily run, 24/7 on-call rotation, application-domain lead with the business IT departments; team training on Ansible, Jenkins, Artifactory and Bitbucket, onboarding material.</w:t>
+        <w:t xml:space="preserve">Daily run, 24/7 on-call rotation, application-domain lead with the business IT departments; team training and onboarding material.</w:t>
       </w:r>
     </w:p>
     <w:p>

</xml_diff>